<commit_message>
UI and Email: reimagined business logic and added password recovery for email addresses
</commit_message>
<xml_diff>
--- a/docs/Wireframes.docx
+++ b/docs/Wireframes.docx
@@ -936,7 +936,13 @@
         <w:rPr>
           <w:rFonts w:ascii="Times New Roman" w:hAnsi="Times New Roman" w:cs="Times New Roman"/>
         </w:rPr>
-        <w:t>SIGNUP PAGE STEP-2:</w:t>
+        <w:t>Role Application</w:t>
+      </w:r>
+      <w:r>
+        <w:rPr>
+          <w:rFonts w:ascii="Times New Roman" w:hAnsi="Times New Roman" w:cs="Times New Roman"/>
+        </w:rPr>
+        <w:t>:</w:t>
       </w:r>
     </w:p>
     <w:p>
@@ -1142,9 +1148,95 @@
       <w:r>
         <w:rPr>
           <w:rFonts w:ascii="Times New Roman" w:hAnsi="Times New Roman" w:cs="Times New Roman"/>
+        </w:rPr>
+        <w:lastRenderedPageBreak/>
+        <w:t>SMTP feature for staff role application</w:t>
+      </w:r>
+    </w:p>
+    <w:p>
+      <w:pPr>
+        <w:rPr>
+          <w:rFonts w:ascii="Times New Roman" w:hAnsi="Times New Roman" w:cs="Times New Roman"/>
+        </w:rPr>
+      </w:pPr>
+      <w:r>
+        <w:rPr>
+          <w:rFonts w:ascii="Times New Roman" w:hAnsi="Times New Roman" w:cs="Times New Roman"/>
           <w:noProof/>
         </w:rPr>
-        <w:lastRenderedPageBreak/>
+        <w:drawing>
+          <wp:inline distT="0" distB="0" distL="0" distR="0" wp14:anchorId="5113D119" wp14:editId="7885C60F">
+            <wp:extent cx="5905500" cy="4335780"/>
+            <wp:effectExtent l="0" t="0" r="0" b="7620"/>
+            <wp:docPr id="1791276801" name="Picture 1"/>
+            <wp:cNvGraphicFramePr>
+              <a:graphicFrameLocks xmlns:a="http://schemas.openxmlformats.org/drawingml/2006/main" noChangeAspect="1"/>
+            </wp:cNvGraphicFramePr>
+            <a:graphic xmlns:a="http://schemas.openxmlformats.org/drawingml/2006/main">
+              <a:graphicData uri="http://schemas.openxmlformats.org/drawingml/2006/picture">
+                <pic:pic xmlns:pic="http://schemas.openxmlformats.org/drawingml/2006/picture">
+                  <pic:nvPicPr>
+                    <pic:cNvPr id="0" name="Picture 3"/>
+                    <pic:cNvPicPr>
+                      <a:picLocks noChangeAspect="1" noChangeArrowheads="1"/>
+                    </pic:cNvPicPr>
+                  </pic:nvPicPr>
+                  <pic:blipFill rotWithShape="1">
+                    <a:blip r:embed="rId15">
+                      <a:extLst>
+                        <a:ext uri="{28A0092B-C50C-407E-A947-70E740481C1C}">
+                          <a14:useLocalDpi xmlns:a14="http://schemas.microsoft.com/office/drawing/2010/main" val="0"/>
+                        </a:ext>
+                      </a:extLst>
+                    </a:blip>
+                    <a:srcRect b="34897"/>
+                    <a:stretch>
+                      <a:fillRect/>
+                    </a:stretch>
+                  </pic:blipFill>
+                  <pic:spPr bwMode="auto">
+                    <a:xfrm>
+                      <a:off x="0" y="0"/>
+                      <a:ext cx="5905500" cy="4335780"/>
+                    </a:xfrm>
+                    <a:prstGeom prst="rect">
+                      <a:avLst/>
+                    </a:prstGeom>
+                    <a:noFill/>
+                    <a:ln>
+                      <a:noFill/>
+                    </a:ln>
+                    <a:extLst>
+                      <a:ext uri="{53640926-AAD7-44D8-BBD7-CCE9431645EC}">
+                        <a14:shadowObscured xmlns:a14="http://schemas.microsoft.com/office/drawing/2010/main"/>
+                      </a:ext>
+                    </a:extLst>
+                  </pic:spPr>
+                </pic:pic>
+              </a:graphicData>
+            </a:graphic>
+          </wp:inline>
+        </w:drawing>
+      </w:r>
+    </w:p>
+    <w:p>
+      <w:pPr>
+        <w:rPr>
+          <w:rFonts w:ascii="Times New Roman" w:hAnsi="Times New Roman" w:cs="Times New Roman"/>
+        </w:rPr>
+      </w:pPr>
+    </w:p>
+    <w:p>
+      <w:pPr>
+        <w:rPr>
+          <w:rFonts w:ascii="Times New Roman" w:hAnsi="Times New Roman" w:cs="Times New Roman"/>
+        </w:rPr>
+      </w:pPr>
+      <w:r>
+        <w:rPr>
+          <w:rFonts w:ascii="Times New Roman" w:hAnsi="Times New Roman" w:cs="Times New Roman"/>
+          <w:noProof/>
+        </w:rPr>
         <w:drawing>
           <wp:anchor distT="0" distB="0" distL="114300" distR="114300" simplePos="0" relativeHeight="251667456" behindDoc="0" locked="0" layoutInCell="1" allowOverlap="1" wp14:anchorId="4181C6EC" wp14:editId="7135EAFA">
             <wp:simplePos x="0" y="0"/>
@@ -1171,7 +1263,7 @@
                     </pic:cNvPicPr>
                   </pic:nvPicPr>
                   <pic:blipFill>
-                    <a:blip r:embed="rId15" cstate="print">
+                    <a:blip r:embed="rId16" cstate="print">
                       <a:extLst>
                         <a:ext uri="{28A0092B-C50C-407E-A947-70E740481C1C}">
                           <a14:useLocalDpi xmlns:a14="http://schemas.microsoft.com/office/drawing/2010/main" val="0"/>
@@ -1313,10 +1405,39 @@
           <w:rFonts w:ascii="Times New Roman" w:hAnsi="Times New Roman" w:cs="Times New Roman"/>
         </w:rPr>
       </w:pPr>
-      <w:r>
-        <w:rPr>
-          <w:rFonts w:ascii="Times New Roman" w:hAnsi="Times New Roman" w:cs="Times New Roman"/>
-        </w:rPr>
+    </w:p>
+    <w:p>
+      <w:pPr>
+        <w:rPr>
+          <w:rFonts w:ascii="Times New Roman" w:hAnsi="Times New Roman" w:cs="Times New Roman"/>
+        </w:rPr>
+      </w:pPr>
+    </w:p>
+    <w:p>
+      <w:pPr>
+        <w:rPr>
+          <w:rFonts w:ascii="Times New Roman" w:hAnsi="Times New Roman" w:cs="Times New Roman"/>
+        </w:rPr>
+      </w:pPr>
+    </w:p>
+    <w:p>
+      <w:pPr>
+        <w:rPr>
+          <w:rFonts w:ascii="Times New Roman" w:hAnsi="Times New Roman" w:cs="Times New Roman"/>
+        </w:rPr>
+      </w:pPr>
+    </w:p>
+    <w:p>
+      <w:pPr>
+        <w:rPr>
+          <w:rFonts w:ascii="Times New Roman" w:hAnsi="Times New Roman" w:cs="Times New Roman"/>
+        </w:rPr>
+      </w:pPr>
+      <w:r>
+        <w:rPr>
+          <w:rFonts w:ascii="Times New Roman" w:hAnsi="Times New Roman" w:cs="Times New Roman"/>
+        </w:rPr>
+        <w:lastRenderedPageBreak/>
         <w:t>USER DASHBOARD (</w:t>
       </w:r>
       <w:r>
@@ -1361,7 +1482,7 @@
                     </pic:cNvPicPr>
                   </pic:nvPicPr>
                   <pic:blipFill>
-                    <a:blip r:embed="rId16" cstate="print">
+                    <a:blip r:embed="rId17" cstate="print">
                       <a:extLst>
                         <a:ext uri="{28A0092B-C50C-407E-A947-70E740481C1C}">
                           <a14:useLocalDpi xmlns:a14="http://schemas.microsoft.com/office/drawing/2010/main" val="0"/>
@@ -1410,7 +1531,6 @@
         <w:rPr>
           <w:rFonts w:ascii="Times New Roman" w:hAnsi="Times New Roman" w:cs="Times New Roman"/>
         </w:rPr>
-        <w:lastRenderedPageBreak/>
         <w:t>USER DASHBOARD (COMPLAINT APPLICATION FORM STEP-2):</w:t>
       </w:r>
       <w:r>
@@ -1436,7 +1556,7 @@
                     </pic:cNvPicPr>
                   </pic:nvPicPr>
                   <pic:blipFill>
-                    <a:blip r:embed="rId17" cstate="print">
+                    <a:blip r:embed="rId18" cstate="print">
                       <a:extLst>
                         <a:ext uri="{28A0092B-C50C-407E-A947-70E740481C1C}">
                           <a14:useLocalDpi xmlns:a14="http://schemas.microsoft.com/office/drawing/2010/main" val="0"/>
@@ -1481,10 +1601,74 @@
           <w:rFonts w:ascii="Times New Roman" w:hAnsi="Times New Roman" w:cs="Times New Roman"/>
         </w:rPr>
       </w:pPr>
-      <w:r>
-        <w:rPr>
-          <w:rFonts w:ascii="Times New Roman" w:hAnsi="Times New Roman" w:cs="Times New Roman"/>
-        </w:rPr>
+    </w:p>
+    <w:p>
+      <w:pPr>
+        <w:rPr>
+          <w:rFonts w:ascii="Times New Roman" w:hAnsi="Times New Roman" w:cs="Times New Roman"/>
+        </w:rPr>
+      </w:pPr>
+    </w:p>
+    <w:p>
+      <w:pPr>
+        <w:rPr>
+          <w:rFonts w:ascii="Times New Roman" w:hAnsi="Times New Roman" w:cs="Times New Roman"/>
+        </w:rPr>
+      </w:pPr>
+    </w:p>
+    <w:p>
+      <w:pPr>
+        <w:rPr>
+          <w:rFonts w:ascii="Times New Roman" w:hAnsi="Times New Roman" w:cs="Times New Roman"/>
+        </w:rPr>
+      </w:pPr>
+    </w:p>
+    <w:p>
+      <w:pPr>
+        <w:rPr>
+          <w:rFonts w:ascii="Times New Roman" w:hAnsi="Times New Roman" w:cs="Times New Roman"/>
+        </w:rPr>
+      </w:pPr>
+    </w:p>
+    <w:p>
+      <w:pPr>
+        <w:rPr>
+          <w:rFonts w:ascii="Times New Roman" w:hAnsi="Times New Roman" w:cs="Times New Roman"/>
+        </w:rPr>
+      </w:pPr>
+    </w:p>
+    <w:p>
+      <w:pPr>
+        <w:rPr>
+          <w:rFonts w:ascii="Times New Roman" w:hAnsi="Times New Roman" w:cs="Times New Roman"/>
+        </w:rPr>
+      </w:pPr>
+    </w:p>
+    <w:p>
+      <w:pPr>
+        <w:rPr>
+          <w:rFonts w:ascii="Times New Roman" w:hAnsi="Times New Roman" w:cs="Times New Roman"/>
+        </w:rPr>
+      </w:pPr>
+    </w:p>
+    <w:p>
+      <w:pPr>
+        <w:rPr>
+          <w:rFonts w:ascii="Times New Roman" w:hAnsi="Times New Roman" w:cs="Times New Roman"/>
+        </w:rPr>
+      </w:pPr>
+    </w:p>
+    <w:p>
+      <w:pPr>
+        <w:rPr>
+          <w:rFonts w:ascii="Times New Roman" w:hAnsi="Times New Roman" w:cs="Times New Roman"/>
+        </w:rPr>
+      </w:pPr>
+      <w:r>
+        <w:rPr>
+          <w:rFonts w:ascii="Times New Roman" w:hAnsi="Times New Roman" w:cs="Times New Roman"/>
+        </w:rPr>
+        <w:lastRenderedPageBreak/>
         <w:t>USER DASHBOARD (COMPLAINT APPLICATION FORM STEP-3):</w:t>
       </w:r>
     </w:p>
@@ -1517,7 +1701,7 @@
                     </pic:cNvPicPr>
                   </pic:nvPicPr>
                   <pic:blipFill>
-                    <a:blip r:embed="rId18" cstate="print">
+                    <a:blip r:embed="rId19" cstate="print">
                       <a:extLst>
                         <a:ext uri="{28A0092B-C50C-407E-A947-70E740481C1C}">
                           <a14:useLocalDpi xmlns:a14="http://schemas.microsoft.com/office/drawing/2010/main" val="0"/>
@@ -1591,7 +1775,7 @@
                     </pic:cNvPicPr>
                   </pic:nvPicPr>
                   <pic:blipFill>
-                    <a:blip r:embed="rId19" cstate="print">
+                    <a:blip r:embed="rId20" cstate="print">
                       <a:extLst>
                         <a:ext uri="{28A0092B-C50C-407E-A947-70E740481C1C}">
                           <a14:useLocalDpi xmlns:a14="http://schemas.microsoft.com/office/drawing/2010/main" val="0"/>
@@ -1632,15 +1816,19 @@
     </w:p>
     <w:p>
       <w:pPr>
-        <w:rPr>
-          <w:rFonts w:ascii="Times New Roman" w:hAnsi="Times New Roman" w:cs="Times New Roman"/>
-        </w:rPr>
-      </w:pPr>
-      <w:r>
-        <w:rPr>
-          <w:rFonts w:ascii="Times New Roman" w:hAnsi="Times New Roman" w:cs="Times New Roman"/>
-        </w:rPr>
-        <w:lastRenderedPageBreak/>
+        <w:jc w:val="center"/>
+        <w:rPr>
+          <w:rFonts w:ascii="Times New Roman" w:hAnsi="Times New Roman" w:cs="Times New Roman"/>
+          <w:b/>
+          <w:bCs/>
+        </w:rPr>
+      </w:pPr>
+      <w:r>
+        <w:rPr>
+          <w:rFonts w:ascii="Times New Roman" w:hAnsi="Times New Roman" w:cs="Times New Roman"/>
+          <w:b/>
+          <w:bCs/>
+        </w:rPr>
         <w:t>USER COMPLAINT TROUBLESHOOTING LIVE-CHAT WITH STAFF</w:t>
       </w:r>
     </w:p>
@@ -1676,191 +1864,6 @@
                 <pic:pic xmlns:pic="http://schemas.openxmlformats.org/drawingml/2006/picture">
                   <pic:nvPicPr>
                     <pic:cNvPr id="0" name="Picture 1"/>
-                    <pic:cNvPicPr>
-                      <a:picLocks noChangeAspect="1" noChangeArrowheads="1"/>
-                    </pic:cNvPicPr>
-                  </pic:nvPicPr>
-                  <pic:blipFill>
-                    <a:blip r:embed="rId20" cstate="print">
-                      <a:extLst>
-                        <a:ext uri="{28A0092B-C50C-407E-A947-70E740481C1C}">
-                          <a14:useLocalDpi xmlns:a14="http://schemas.microsoft.com/office/drawing/2010/main" val="0"/>
-                        </a:ext>
-                      </a:extLst>
-                    </a:blip>
-                    <a:srcRect/>
-                    <a:stretch>
-                      <a:fillRect/>
-                    </a:stretch>
-                  </pic:blipFill>
-                  <pic:spPr bwMode="auto">
-                    <a:xfrm>
-                      <a:off x="0" y="0"/>
-                      <a:ext cx="5943600" cy="3779520"/>
-                    </a:xfrm>
-                    <a:prstGeom prst="rect">
-                      <a:avLst/>
-                    </a:prstGeom>
-                    <a:noFill/>
-                    <a:ln>
-                      <a:noFill/>
-                    </a:ln>
-                  </pic:spPr>
-                </pic:pic>
-              </a:graphicData>
-            </a:graphic>
-          </wp:anchor>
-        </w:drawing>
-      </w:r>
-      <w:r>
-        <w:rPr>
-          <w:rFonts w:ascii="Times New Roman" w:hAnsi="Times New Roman" w:cs="Times New Roman"/>
-        </w:rPr>
-        <w:t xml:space="preserve">USER </w:t>
-      </w:r>
-      <w:r>
-        <w:rPr>
-          <w:rFonts w:ascii="Times New Roman" w:hAnsi="Times New Roman" w:cs="Times New Roman"/>
-        </w:rPr>
-        <w:t>CHAT</w:t>
-      </w:r>
-      <w:r>
-        <w:rPr>
-          <w:rFonts w:ascii="Times New Roman" w:hAnsi="Times New Roman" w:cs="Times New Roman"/>
-        </w:rPr>
-        <w:t>:</w:t>
-      </w:r>
-    </w:p>
-    <w:p>
-      <w:pPr>
-        <w:rPr>
-          <w:rFonts w:ascii="Times New Roman" w:hAnsi="Times New Roman" w:cs="Times New Roman"/>
-        </w:rPr>
-      </w:pPr>
-    </w:p>
-    <w:p>
-      <w:pPr>
-        <w:rPr>
-          <w:rFonts w:ascii="Times New Roman" w:hAnsi="Times New Roman" w:cs="Times New Roman"/>
-        </w:rPr>
-      </w:pPr>
-    </w:p>
-    <w:p>
-      <w:pPr>
-        <w:rPr>
-          <w:rFonts w:ascii="Times New Roman" w:hAnsi="Times New Roman" w:cs="Times New Roman"/>
-        </w:rPr>
-      </w:pPr>
-    </w:p>
-    <w:p>
-      <w:pPr>
-        <w:rPr>
-          <w:rFonts w:ascii="Times New Roman" w:hAnsi="Times New Roman" w:cs="Times New Roman"/>
-        </w:rPr>
-      </w:pPr>
-    </w:p>
-    <w:p>
-      <w:pPr>
-        <w:rPr>
-          <w:rFonts w:ascii="Times New Roman" w:hAnsi="Times New Roman" w:cs="Times New Roman"/>
-        </w:rPr>
-      </w:pPr>
-    </w:p>
-    <w:p>
-      <w:pPr>
-        <w:rPr>
-          <w:rFonts w:ascii="Times New Roman" w:hAnsi="Times New Roman" w:cs="Times New Roman"/>
-        </w:rPr>
-      </w:pPr>
-    </w:p>
-    <w:p>
-      <w:pPr>
-        <w:rPr>
-          <w:rFonts w:ascii="Times New Roman" w:hAnsi="Times New Roman" w:cs="Times New Roman"/>
-        </w:rPr>
-      </w:pPr>
-    </w:p>
-    <w:p>
-      <w:pPr>
-        <w:rPr>
-          <w:rFonts w:ascii="Times New Roman" w:hAnsi="Times New Roman" w:cs="Times New Roman"/>
-        </w:rPr>
-      </w:pPr>
-    </w:p>
-    <w:p>
-      <w:pPr>
-        <w:rPr>
-          <w:rFonts w:ascii="Times New Roman" w:hAnsi="Times New Roman" w:cs="Times New Roman"/>
-        </w:rPr>
-      </w:pPr>
-    </w:p>
-    <w:p>
-      <w:pPr>
-        <w:rPr>
-          <w:rFonts w:ascii="Times New Roman" w:hAnsi="Times New Roman" w:cs="Times New Roman"/>
-        </w:rPr>
-      </w:pPr>
-    </w:p>
-    <w:p>
-      <w:pPr>
-        <w:rPr>
-          <w:rFonts w:ascii="Times New Roman" w:hAnsi="Times New Roman" w:cs="Times New Roman"/>
-        </w:rPr>
-      </w:pPr>
-    </w:p>
-    <w:p>
-      <w:pPr>
-        <w:rPr>
-          <w:rFonts w:ascii="Times New Roman" w:hAnsi="Times New Roman" w:cs="Times New Roman"/>
-        </w:rPr>
-      </w:pPr>
-    </w:p>
-    <w:p>
-      <w:pPr>
-        <w:rPr>
-          <w:rFonts w:ascii="Times New Roman" w:hAnsi="Times New Roman" w:cs="Times New Roman"/>
-        </w:rPr>
-      </w:pPr>
-    </w:p>
-    <w:p>
-      <w:pPr>
-        <w:rPr>
-          <w:rFonts w:ascii="Times New Roman" w:hAnsi="Times New Roman" w:cs="Times New Roman"/>
-        </w:rPr>
-      </w:pPr>
-    </w:p>
-    <w:p>
-      <w:pPr>
-        <w:rPr>
-          <w:rFonts w:ascii="Times New Roman" w:hAnsi="Times New Roman" w:cs="Times New Roman"/>
-        </w:rPr>
-      </w:pPr>
-      <w:r>
-        <w:rPr>
-          <w:rFonts w:ascii="Times New Roman" w:hAnsi="Times New Roman" w:cs="Times New Roman"/>
-          <w:noProof/>
-        </w:rPr>
-        <w:drawing>
-          <wp:anchor distT="0" distB="0" distL="114300" distR="114300" simplePos="0" relativeHeight="251671552" behindDoc="0" locked="0" layoutInCell="1" allowOverlap="1" wp14:anchorId="2FCE6BF4" wp14:editId="6CAFD597">
-            <wp:simplePos x="0" y="0"/>
-            <wp:positionH relativeFrom="column">
-              <wp:posOffset>0</wp:posOffset>
-            </wp:positionH>
-            <wp:positionV relativeFrom="paragraph">
-              <wp:posOffset>302895</wp:posOffset>
-            </wp:positionV>
-            <wp:extent cx="5943600" cy="3779520"/>
-            <wp:effectExtent l="0" t="0" r="0" b="0"/>
-            <wp:wrapNone/>
-            <wp:docPr id="544546443" name="Picture 2"/>
-            <wp:cNvGraphicFramePr>
-              <a:graphicFrameLocks xmlns:a="http://schemas.openxmlformats.org/drawingml/2006/main" noChangeAspect="1"/>
-            </wp:cNvGraphicFramePr>
-            <a:graphic xmlns:a="http://schemas.openxmlformats.org/drawingml/2006/main">
-              <a:graphicData uri="http://schemas.openxmlformats.org/drawingml/2006/picture">
-                <pic:pic xmlns:pic="http://schemas.openxmlformats.org/drawingml/2006/picture">
-                  <pic:nvPicPr>
-                    <pic:cNvPr id="0" name="Picture 2"/>
                     <pic:cNvPicPr>
                       <a:picLocks noChangeAspect="1" noChangeArrowheads="1"/>
                     </pic:cNvPicPr>
@@ -1901,6 +1904,178 @@
         <w:rPr>
           <w:rFonts w:ascii="Times New Roman" w:hAnsi="Times New Roman" w:cs="Times New Roman"/>
         </w:rPr>
+        <w:t xml:space="preserve">USER </w:t>
+      </w:r>
+      <w:r>
+        <w:rPr>
+          <w:rFonts w:ascii="Times New Roman" w:hAnsi="Times New Roman" w:cs="Times New Roman"/>
+        </w:rPr>
+        <w:t>CHAT</w:t>
+      </w:r>
+      <w:r>
+        <w:rPr>
+          <w:rFonts w:ascii="Times New Roman" w:hAnsi="Times New Roman" w:cs="Times New Roman"/>
+        </w:rPr>
+        <w:t>:</w:t>
+      </w:r>
+    </w:p>
+    <w:p>
+      <w:pPr>
+        <w:rPr>
+          <w:rFonts w:ascii="Times New Roman" w:hAnsi="Times New Roman" w:cs="Times New Roman"/>
+        </w:rPr>
+      </w:pPr>
+    </w:p>
+    <w:p>
+      <w:pPr>
+        <w:rPr>
+          <w:rFonts w:ascii="Times New Roman" w:hAnsi="Times New Roman" w:cs="Times New Roman"/>
+        </w:rPr>
+      </w:pPr>
+    </w:p>
+    <w:p>
+      <w:pPr>
+        <w:rPr>
+          <w:rFonts w:ascii="Times New Roman" w:hAnsi="Times New Roman" w:cs="Times New Roman"/>
+        </w:rPr>
+      </w:pPr>
+    </w:p>
+    <w:p>
+      <w:pPr>
+        <w:rPr>
+          <w:rFonts w:ascii="Times New Roman" w:hAnsi="Times New Roman" w:cs="Times New Roman"/>
+        </w:rPr>
+      </w:pPr>
+    </w:p>
+    <w:p>
+      <w:pPr>
+        <w:rPr>
+          <w:rFonts w:ascii="Times New Roman" w:hAnsi="Times New Roman" w:cs="Times New Roman"/>
+        </w:rPr>
+      </w:pPr>
+    </w:p>
+    <w:p>
+      <w:pPr>
+        <w:rPr>
+          <w:rFonts w:ascii="Times New Roman" w:hAnsi="Times New Roman" w:cs="Times New Roman"/>
+        </w:rPr>
+      </w:pPr>
+    </w:p>
+    <w:p>
+      <w:pPr>
+        <w:rPr>
+          <w:rFonts w:ascii="Times New Roman" w:hAnsi="Times New Roman" w:cs="Times New Roman"/>
+        </w:rPr>
+      </w:pPr>
+    </w:p>
+    <w:p>
+      <w:pPr>
+        <w:rPr>
+          <w:rFonts w:ascii="Times New Roman" w:hAnsi="Times New Roman" w:cs="Times New Roman"/>
+        </w:rPr>
+      </w:pPr>
+    </w:p>
+    <w:p>
+      <w:pPr>
+        <w:rPr>
+          <w:rFonts w:ascii="Times New Roman" w:hAnsi="Times New Roman" w:cs="Times New Roman"/>
+        </w:rPr>
+      </w:pPr>
+    </w:p>
+    <w:p>
+      <w:pPr>
+        <w:rPr>
+          <w:rFonts w:ascii="Times New Roman" w:hAnsi="Times New Roman" w:cs="Times New Roman"/>
+        </w:rPr>
+      </w:pPr>
+    </w:p>
+    <w:p>
+      <w:pPr>
+        <w:rPr>
+          <w:rFonts w:ascii="Times New Roman" w:hAnsi="Times New Roman" w:cs="Times New Roman"/>
+        </w:rPr>
+      </w:pPr>
+    </w:p>
+    <w:p>
+      <w:pPr>
+        <w:rPr>
+          <w:rFonts w:ascii="Times New Roman" w:hAnsi="Times New Roman" w:cs="Times New Roman"/>
+        </w:rPr>
+      </w:pPr>
+    </w:p>
+    <w:p>
+      <w:pPr>
+        <w:rPr>
+          <w:rFonts w:ascii="Times New Roman" w:hAnsi="Times New Roman" w:cs="Times New Roman"/>
+        </w:rPr>
+      </w:pPr>
+      <w:r>
+        <w:rPr>
+          <w:rFonts w:ascii="Times New Roman" w:hAnsi="Times New Roman" w:cs="Times New Roman"/>
+          <w:noProof/>
+        </w:rPr>
+        <w:lastRenderedPageBreak/>
+        <w:drawing>
+          <wp:anchor distT="0" distB="0" distL="114300" distR="114300" simplePos="0" relativeHeight="251671552" behindDoc="0" locked="0" layoutInCell="1" allowOverlap="1" wp14:anchorId="2FCE6BF4" wp14:editId="6CAFD597">
+            <wp:simplePos x="0" y="0"/>
+            <wp:positionH relativeFrom="column">
+              <wp:posOffset>0</wp:posOffset>
+            </wp:positionH>
+            <wp:positionV relativeFrom="paragraph">
+              <wp:posOffset>302895</wp:posOffset>
+            </wp:positionV>
+            <wp:extent cx="5943600" cy="3779520"/>
+            <wp:effectExtent l="0" t="0" r="0" b="0"/>
+            <wp:wrapNone/>
+            <wp:docPr id="544546443" name="Picture 2"/>
+            <wp:cNvGraphicFramePr>
+              <a:graphicFrameLocks xmlns:a="http://schemas.openxmlformats.org/drawingml/2006/main" noChangeAspect="1"/>
+            </wp:cNvGraphicFramePr>
+            <a:graphic xmlns:a="http://schemas.openxmlformats.org/drawingml/2006/main">
+              <a:graphicData uri="http://schemas.openxmlformats.org/drawingml/2006/picture">
+                <pic:pic xmlns:pic="http://schemas.openxmlformats.org/drawingml/2006/picture">
+                  <pic:nvPicPr>
+                    <pic:cNvPr id="0" name="Picture 2"/>
+                    <pic:cNvPicPr>
+                      <a:picLocks noChangeAspect="1" noChangeArrowheads="1"/>
+                    </pic:cNvPicPr>
+                  </pic:nvPicPr>
+                  <pic:blipFill>
+                    <a:blip r:embed="rId22" cstate="print">
+                      <a:extLst>
+                        <a:ext uri="{28A0092B-C50C-407E-A947-70E740481C1C}">
+                          <a14:useLocalDpi xmlns:a14="http://schemas.microsoft.com/office/drawing/2010/main" val="0"/>
+                        </a:ext>
+                      </a:extLst>
+                    </a:blip>
+                    <a:srcRect/>
+                    <a:stretch>
+                      <a:fillRect/>
+                    </a:stretch>
+                  </pic:blipFill>
+                  <pic:spPr bwMode="auto">
+                    <a:xfrm>
+                      <a:off x="0" y="0"/>
+                      <a:ext cx="5943600" cy="3779520"/>
+                    </a:xfrm>
+                    <a:prstGeom prst="rect">
+                      <a:avLst/>
+                    </a:prstGeom>
+                    <a:noFill/>
+                    <a:ln>
+                      <a:noFill/>
+                    </a:ln>
+                  </pic:spPr>
+                </pic:pic>
+              </a:graphicData>
+            </a:graphic>
+          </wp:anchor>
+        </w:drawing>
+      </w:r>
+      <w:r>
+        <w:rPr>
+          <w:rFonts w:ascii="Times New Roman" w:hAnsi="Times New Roman" w:cs="Times New Roman"/>
+        </w:rPr>
         <w:t xml:space="preserve">STAFF </w:t>
       </w:r>
       <w:r>
@@ -2013,53 +2188,10 @@
           <w:rFonts w:ascii="Times New Roman" w:hAnsi="Times New Roman" w:cs="Times New Roman"/>
         </w:rPr>
       </w:pPr>
-    </w:p>
-    <w:p>
-      <w:pPr>
-        <w:rPr>
-          <w:rFonts w:ascii="Times New Roman" w:hAnsi="Times New Roman" w:cs="Times New Roman"/>
-        </w:rPr>
-      </w:pPr>
-    </w:p>
-    <w:p>
-      <w:pPr>
-        <w:rPr>
-          <w:rFonts w:ascii="Times New Roman" w:hAnsi="Times New Roman" w:cs="Times New Roman"/>
-        </w:rPr>
-      </w:pPr>
-    </w:p>
-    <w:p>
-      <w:pPr>
-        <w:rPr>
-          <w:rFonts w:ascii="Times New Roman" w:hAnsi="Times New Roman" w:cs="Times New Roman"/>
-        </w:rPr>
-      </w:pPr>
-    </w:p>
-    <w:p>
-      <w:pPr>
-        <w:rPr>
-          <w:rFonts w:ascii="Times New Roman" w:hAnsi="Times New Roman" w:cs="Times New Roman"/>
-        </w:rPr>
-      </w:pPr>
-    </w:p>
-    <w:p>
-      <w:pPr>
-        <w:rPr>
-          <w:rFonts w:ascii="Times New Roman" w:hAnsi="Times New Roman" w:cs="Times New Roman"/>
-        </w:rPr>
-      </w:pPr>
-    </w:p>
-    <w:p>
-      <w:pPr>
-        <w:rPr>
-          <w:rFonts w:ascii="Times New Roman" w:hAnsi="Times New Roman" w:cs="Times New Roman"/>
-        </w:rPr>
-      </w:pPr>
-      <w:r>
-        <w:rPr>
-          <w:rFonts w:ascii="Times New Roman" w:hAnsi="Times New Roman" w:cs="Times New Roman"/>
-        </w:rPr>
-        <w:lastRenderedPageBreak/>
+      <w:r>
+        <w:rPr>
+          <w:rFonts w:ascii="Times New Roman" w:hAnsi="Times New Roman" w:cs="Times New Roman"/>
+        </w:rPr>
         <w:t>SOLUTION PROPOSAL:</w:t>
       </w:r>
     </w:p>
@@ -2095,178 +2227,6 @@
                 <pic:pic xmlns:pic="http://schemas.openxmlformats.org/drawingml/2006/picture">
                   <pic:nvPicPr>
                     <pic:cNvPr id="0" name="Picture 12"/>
-                    <pic:cNvPicPr>
-                      <a:picLocks noChangeAspect="1" noChangeArrowheads="1"/>
-                    </pic:cNvPicPr>
-                  </pic:nvPicPr>
-                  <pic:blipFill>
-                    <a:blip r:embed="rId22" cstate="print">
-                      <a:extLst>
-                        <a:ext uri="{28A0092B-C50C-407E-A947-70E740481C1C}">
-                          <a14:useLocalDpi xmlns:a14="http://schemas.microsoft.com/office/drawing/2010/main" val="0"/>
-                        </a:ext>
-                      </a:extLst>
-                    </a:blip>
-                    <a:srcRect/>
-                    <a:stretch>
-                      <a:fillRect/>
-                    </a:stretch>
-                  </pic:blipFill>
-                  <pic:spPr bwMode="auto">
-                    <a:xfrm>
-                      <a:off x="0" y="0"/>
-                      <a:ext cx="5943600" cy="3784600"/>
-                    </a:xfrm>
-                    <a:prstGeom prst="rect">
-                      <a:avLst/>
-                    </a:prstGeom>
-                    <a:noFill/>
-                    <a:ln>
-                      <a:noFill/>
-                    </a:ln>
-                  </pic:spPr>
-                </pic:pic>
-              </a:graphicData>
-            </a:graphic>
-            <wp14:sizeRelH relativeFrom="margin">
-              <wp14:pctWidth>0</wp14:pctWidth>
-            </wp14:sizeRelH>
-            <wp14:sizeRelV relativeFrom="margin">
-              <wp14:pctHeight>0</wp14:pctHeight>
-            </wp14:sizeRelV>
-          </wp:anchor>
-        </w:drawing>
-      </w:r>
-    </w:p>
-    <w:p>
-      <w:pPr>
-        <w:rPr>
-          <w:rFonts w:ascii="Times New Roman" w:hAnsi="Times New Roman" w:cs="Times New Roman"/>
-        </w:rPr>
-      </w:pPr>
-    </w:p>
-    <w:p>
-      <w:pPr>
-        <w:rPr>
-          <w:rFonts w:ascii="Times New Roman" w:hAnsi="Times New Roman" w:cs="Times New Roman"/>
-        </w:rPr>
-      </w:pPr>
-    </w:p>
-    <w:p>
-      <w:pPr>
-        <w:rPr>
-          <w:rFonts w:ascii="Times New Roman" w:hAnsi="Times New Roman" w:cs="Times New Roman"/>
-        </w:rPr>
-      </w:pPr>
-    </w:p>
-    <w:p>
-      <w:pPr>
-        <w:rPr>
-          <w:rFonts w:ascii="Times New Roman" w:hAnsi="Times New Roman" w:cs="Times New Roman"/>
-        </w:rPr>
-      </w:pPr>
-    </w:p>
-    <w:p>
-      <w:pPr>
-        <w:rPr>
-          <w:rFonts w:ascii="Times New Roman" w:hAnsi="Times New Roman" w:cs="Times New Roman"/>
-        </w:rPr>
-      </w:pPr>
-    </w:p>
-    <w:p>
-      <w:pPr>
-        <w:rPr>
-          <w:rFonts w:ascii="Times New Roman" w:hAnsi="Times New Roman" w:cs="Times New Roman"/>
-        </w:rPr>
-      </w:pPr>
-    </w:p>
-    <w:p>
-      <w:pPr>
-        <w:rPr>
-          <w:rFonts w:ascii="Times New Roman" w:hAnsi="Times New Roman" w:cs="Times New Roman"/>
-        </w:rPr>
-      </w:pPr>
-    </w:p>
-    <w:p>
-      <w:pPr>
-        <w:rPr>
-          <w:rFonts w:ascii="Times New Roman" w:hAnsi="Times New Roman" w:cs="Times New Roman"/>
-        </w:rPr>
-      </w:pPr>
-    </w:p>
-    <w:p>
-      <w:pPr>
-        <w:rPr>
-          <w:rFonts w:ascii="Times New Roman" w:hAnsi="Times New Roman" w:cs="Times New Roman"/>
-        </w:rPr>
-      </w:pPr>
-    </w:p>
-    <w:p>
-      <w:pPr>
-        <w:rPr>
-          <w:rFonts w:ascii="Times New Roman" w:hAnsi="Times New Roman" w:cs="Times New Roman"/>
-        </w:rPr>
-      </w:pPr>
-    </w:p>
-    <w:p>
-      <w:pPr>
-        <w:rPr>
-          <w:rFonts w:ascii="Times New Roman" w:hAnsi="Times New Roman" w:cs="Times New Roman"/>
-        </w:rPr>
-      </w:pPr>
-    </w:p>
-    <w:p>
-      <w:pPr>
-        <w:rPr>
-          <w:rFonts w:ascii="Times New Roman" w:hAnsi="Times New Roman" w:cs="Times New Roman"/>
-        </w:rPr>
-      </w:pPr>
-    </w:p>
-    <w:p>
-      <w:pPr>
-        <w:rPr>
-          <w:rFonts w:ascii="Times New Roman" w:hAnsi="Times New Roman" w:cs="Times New Roman"/>
-        </w:rPr>
-      </w:pPr>
-      <w:r>
-        <w:rPr>
-          <w:rFonts w:ascii="Times New Roman" w:hAnsi="Times New Roman" w:cs="Times New Roman"/>
-        </w:rPr>
-        <w:t>SOLUTION ACCEPTED (USER):</w:t>
-      </w:r>
-    </w:p>
-    <w:p>
-      <w:pPr>
-        <w:rPr>
-          <w:rFonts w:ascii="Times New Roman" w:hAnsi="Times New Roman" w:cs="Times New Roman"/>
-        </w:rPr>
-      </w:pPr>
-      <w:r>
-        <w:rPr>
-          <w:rFonts w:ascii="Times New Roman" w:hAnsi="Times New Roman" w:cs="Times New Roman"/>
-          <w:noProof/>
-        </w:rPr>
-        <w:drawing>
-          <wp:anchor distT="0" distB="0" distL="114300" distR="114300" simplePos="0" relativeHeight="251677696" behindDoc="0" locked="0" layoutInCell="1" allowOverlap="1" wp14:anchorId="6F788D11" wp14:editId="03481D2F">
-            <wp:simplePos x="0" y="0"/>
-            <wp:positionH relativeFrom="column">
-              <wp:posOffset>0</wp:posOffset>
-            </wp:positionH>
-            <wp:positionV relativeFrom="paragraph">
-              <wp:posOffset>3175</wp:posOffset>
-            </wp:positionV>
-            <wp:extent cx="5943600" cy="3784600"/>
-            <wp:effectExtent l="0" t="0" r="0" b="0"/>
-            <wp:wrapNone/>
-            <wp:docPr id="251300905" name="Picture 13"/>
-            <wp:cNvGraphicFramePr>
-              <a:graphicFrameLocks xmlns:a="http://schemas.openxmlformats.org/drawingml/2006/main" noChangeAspect="1"/>
-            </wp:cNvGraphicFramePr>
-            <a:graphic xmlns:a="http://schemas.openxmlformats.org/drawingml/2006/main">
-              <a:graphicData uri="http://schemas.openxmlformats.org/drawingml/2006/picture">
-                <pic:pic xmlns:pic="http://schemas.openxmlformats.org/drawingml/2006/picture">
-                  <pic:nvPicPr>
-                    <pic:cNvPr id="0" name="Picture 13"/>
                     <pic:cNvPicPr>
                       <a:picLocks noChangeAspect="1" noChangeArrowheads="1"/>
                     </pic:cNvPicPr>
@@ -2459,22 +2419,35 @@
       <w:r>
         <w:rPr>
           <w:rFonts w:ascii="Times New Roman" w:hAnsi="Times New Roman" w:cs="Times New Roman"/>
+        </w:rPr>
+        <w:lastRenderedPageBreak/>
+        <w:t>SOLUTION ACCEPTED (USER):</w:t>
+      </w:r>
+    </w:p>
+    <w:p>
+      <w:pPr>
+        <w:rPr>
+          <w:rFonts w:ascii="Times New Roman" w:hAnsi="Times New Roman" w:cs="Times New Roman"/>
+        </w:rPr>
+      </w:pPr>
+      <w:r>
+        <w:rPr>
+          <w:rFonts w:ascii="Times New Roman" w:hAnsi="Times New Roman" w:cs="Times New Roman"/>
           <w:noProof/>
         </w:rPr>
-        <w:lastRenderedPageBreak/>
         <w:drawing>
-          <wp:anchor distT="0" distB="0" distL="114300" distR="114300" simplePos="0" relativeHeight="251678720" behindDoc="0" locked="0" layoutInCell="1" allowOverlap="1" wp14:anchorId="7076D117" wp14:editId="37884EE9">
+          <wp:anchor distT="0" distB="0" distL="114300" distR="114300" simplePos="0" relativeHeight="251677696" behindDoc="0" locked="0" layoutInCell="1" allowOverlap="1" wp14:anchorId="6F788D11" wp14:editId="03481D2F">
             <wp:simplePos x="0" y="0"/>
             <wp:positionH relativeFrom="column">
-              <wp:posOffset>-50800</wp:posOffset>
+              <wp:posOffset>0</wp:posOffset>
             </wp:positionH>
             <wp:positionV relativeFrom="paragraph">
-              <wp:posOffset>302895</wp:posOffset>
+              <wp:posOffset>3175</wp:posOffset>
             </wp:positionV>
             <wp:extent cx="5943600" cy="3784600"/>
-            <wp:effectExtent l="0" t="0" r="0" b="6350"/>
+            <wp:effectExtent l="0" t="0" r="0" b="0"/>
             <wp:wrapNone/>
-            <wp:docPr id="188950764" name="Picture 14"/>
+            <wp:docPr id="251300905" name="Picture 13"/>
             <wp:cNvGraphicFramePr>
               <a:graphicFrameLocks xmlns:a="http://schemas.openxmlformats.org/drawingml/2006/main" noChangeAspect="1"/>
             </wp:cNvGraphicFramePr>
@@ -2482,7 +2455,7 @@
               <a:graphicData uri="http://schemas.openxmlformats.org/drawingml/2006/picture">
                 <pic:pic xmlns:pic="http://schemas.openxmlformats.org/drawingml/2006/picture">
                   <pic:nvPicPr>
-                    <pic:cNvPr id="0" name="Picture 14"/>
+                    <pic:cNvPr id="0" name="Picture 13"/>
                     <pic:cNvPicPr>
                       <a:picLocks noChangeAspect="1" noChangeArrowheads="1"/>
                     </pic:cNvPicPr>
@@ -2516,119 +2489,106 @@
                 </pic:pic>
               </a:graphicData>
             </a:graphic>
+            <wp14:sizeRelH relativeFrom="margin">
+              <wp14:pctWidth>0</wp14:pctWidth>
+            </wp14:sizeRelH>
+            <wp14:sizeRelV relativeFrom="margin">
+              <wp14:pctHeight>0</wp14:pctHeight>
+            </wp14:sizeRelV>
           </wp:anchor>
         </w:drawing>
       </w:r>
-      <w:r>
-        <w:rPr>
-          <w:rFonts w:ascii="Times New Roman" w:hAnsi="Times New Roman" w:cs="Times New Roman"/>
-        </w:rPr>
-        <w:t>SOLUTION ACCEPTED (STAFF):</w:t>
-      </w:r>
-    </w:p>
-    <w:p>
-      <w:pPr>
-        <w:rPr>
-          <w:rFonts w:ascii="Times New Roman" w:hAnsi="Times New Roman" w:cs="Times New Roman"/>
-        </w:rPr>
-      </w:pPr>
-    </w:p>
-    <w:p>
-      <w:pPr>
-        <w:rPr>
-          <w:rFonts w:ascii="Times New Roman" w:hAnsi="Times New Roman" w:cs="Times New Roman"/>
-        </w:rPr>
-      </w:pPr>
-    </w:p>
-    <w:p>
-      <w:pPr>
-        <w:rPr>
-          <w:rFonts w:ascii="Times New Roman" w:hAnsi="Times New Roman" w:cs="Times New Roman"/>
-        </w:rPr>
-      </w:pPr>
-    </w:p>
-    <w:p>
-      <w:pPr>
-        <w:rPr>
-          <w:rFonts w:ascii="Times New Roman" w:hAnsi="Times New Roman" w:cs="Times New Roman"/>
-        </w:rPr>
-      </w:pPr>
-    </w:p>
-    <w:p>
-      <w:pPr>
-        <w:rPr>
-          <w:rFonts w:ascii="Times New Roman" w:hAnsi="Times New Roman" w:cs="Times New Roman"/>
-        </w:rPr>
-      </w:pPr>
-    </w:p>
-    <w:p>
-      <w:pPr>
-        <w:rPr>
-          <w:rFonts w:ascii="Times New Roman" w:hAnsi="Times New Roman" w:cs="Times New Roman"/>
-        </w:rPr>
-      </w:pPr>
-    </w:p>
-    <w:p>
-      <w:pPr>
-        <w:rPr>
-          <w:rFonts w:ascii="Times New Roman" w:hAnsi="Times New Roman" w:cs="Times New Roman"/>
-        </w:rPr>
-      </w:pPr>
-    </w:p>
-    <w:p>
-      <w:pPr>
-        <w:rPr>
-          <w:rFonts w:ascii="Times New Roman" w:hAnsi="Times New Roman" w:cs="Times New Roman"/>
-        </w:rPr>
-      </w:pPr>
-    </w:p>
-    <w:p>
-      <w:pPr>
-        <w:rPr>
-          <w:rFonts w:ascii="Times New Roman" w:hAnsi="Times New Roman" w:cs="Times New Roman"/>
-        </w:rPr>
-      </w:pPr>
-    </w:p>
-    <w:p>
-      <w:pPr>
-        <w:rPr>
-          <w:rFonts w:ascii="Times New Roman" w:hAnsi="Times New Roman" w:cs="Times New Roman"/>
-        </w:rPr>
-      </w:pPr>
-    </w:p>
-    <w:p>
-      <w:pPr>
-        <w:rPr>
-          <w:rFonts w:ascii="Times New Roman" w:hAnsi="Times New Roman" w:cs="Times New Roman"/>
-        </w:rPr>
-      </w:pPr>
-    </w:p>
-    <w:p>
-      <w:pPr>
-        <w:rPr>
-          <w:rFonts w:ascii="Times New Roman" w:hAnsi="Times New Roman" w:cs="Times New Roman"/>
-        </w:rPr>
-      </w:pPr>
-    </w:p>
-    <w:p>
-      <w:pPr>
-        <w:rPr>
-          <w:rFonts w:ascii="Times New Roman" w:hAnsi="Times New Roman" w:cs="Times New Roman"/>
-        </w:rPr>
-      </w:pPr>
-    </w:p>
-    <w:p>
-      <w:pPr>
-        <w:rPr>
-          <w:rFonts w:ascii="Times New Roman" w:hAnsi="Times New Roman" w:cs="Times New Roman"/>
-        </w:rPr>
-      </w:pPr>
-      <w:r>
-        <w:rPr>
-          <w:rFonts w:ascii="Times New Roman" w:hAnsi="Times New Roman" w:cs="Times New Roman"/>
-        </w:rPr>
-        <w:t>MARK AS SOLVED:</w:t>
-      </w:r>
+    </w:p>
+    <w:p>
+      <w:pPr>
+        <w:rPr>
+          <w:rFonts w:ascii="Times New Roman" w:hAnsi="Times New Roman" w:cs="Times New Roman"/>
+        </w:rPr>
+      </w:pPr>
+    </w:p>
+    <w:p>
+      <w:pPr>
+        <w:rPr>
+          <w:rFonts w:ascii="Times New Roman" w:hAnsi="Times New Roman" w:cs="Times New Roman"/>
+        </w:rPr>
+      </w:pPr>
+    </w:p>
+    <w:p>
+      <w:pPr>
+        <w:rPr>
+          <w:rFonts w:ascii="Times New Roman" w:hAnsi="Times New Roman" w:cs="Times New Roman"/>
+        </w:rPr>
+      </w:pPr>
+    </w:p>
+    <w:p>
+      <w:pPr>
+        <w:rPr>
+          <w:rFonts w:ascii="Times New Roman" w:hAnsi="Times New Roman" w:cs="Times New Roman"/>
+        </w:rPr>
+      </w:pPr>
+    </w:p>
+    <w:p>
+      <w:pPr>
+        <w:rPr>
+          <w:rFonts w:ascii="Times New Roman" w:hAnsi="Times New Roman" w:cs="Times New Roman"/>
+        </w:rPr>
+      </w:pPr>
+    </w:p>
+    <w:p>
+      <w:pPr>
+        <w:rPr>
+          <w:rFonts w:ascii="Times New Roman" w:hAnsi="Times New Roman" w:cs="Times New Roman"/>
+        </w:rPr>
+      </w:pPr>
+    </w:p>
+    <w:p>
+      <w:pPr>
+        <w:rPr>
+          <w:rFonts w:ascii="Times New Roman" w:hAnsi="Times New Roman" w:cs="Times New Roman"/>
+        </w:rPr>
+      </w:pPr>
+    </w:p>
+    <w:p>
+      <w:pPr>
+        <w:rPr>
+          <w:rFonts w:ascii="Times New Roman" w:hAnsi="Times New Roman" w:cs="Times New Roman"/>
+        </w:rPr>
+      </w:pPr>
+    </w:p>
+    <w:p>
+      <w:pPr>
+        <w:rPr>
+          <w:rFonts w:ascii="Times New Roman" w:hAnsi="Times New Roman" w:cs="Times New Roman"/>
+        </w:rPr>
+      </w:pPr>
+    </w:p>
+    <w:p>
+      <w:pPr>
+        <w:rPr>
+          <w:rFonts w:ascii="Times New Roman" w:hAnsi="Times New Roman" w:cs="Times New Roman"/>
+        </w:rPr>
+      </w:pPr>
+    </w:p>
+    <w:p>
+      <w:pPr>
+        <w:rPr>
+          <w:rFonts w:ascii="Times New Roman" w:hAnsi="Times New Roman" w:cs="Times New Roman"/>
+        </w:rPr>
+      </w:pPr>
+    </w:p>
+    <w:p>
+      <w:pPr>
+        <w:rPr>
+          <w:rFonts w:ascii="Times New Roman" w:hAnsi="Times New Roman" w:cs="Times New Roman"/>
+        </w:rPr>
+      </w:pPr>
+    </w:p>
+    <w:p>
+      <w:pPr>
+        <w:rPr>
+          <w:rFonts w:ascii="Times New Roman" w:hAnsi="Times New Roman" w:cs="Times New Roman"/>
+        </w:rPr>
+      </w:pPr>
     </w:p>
     <w:p>
       <w:pPr>
@@ -2642,18 +2602,18 @@
           <w:noProof/>
         </w:rPr>
         <w:drawing>
-          <wp:anchor distT="0" distB="0" distL="114300" distR="114300" simplePos="0" relativeHeight="251679744" behindDoc="0" locked="0" layoutInCell="1" allowOverlap="1" wp14:anchorId="751B7E99" wp14:editId="7BCB0B95">
+          <wp:anchor distT="0" distB="0" distL="114300" distR="114300" simplePos="0" relativeHeight="251678720" behindDoc="0" locked="0" layoutInCell="1" allowOverlap="1" wp14:anchorId="7076D117" wp14:editId="37884EE9">
             <wp:simplePos x="0" y="0"/>
             <wp:positionH relativeFrom="column">
-              <wp:posOffset>0</wp:posOffset>
+              <wp:posOffset>-50800</wp:posOffset>
             </wp:positionH>
             <wp:positionV relativeFrom="paragraph">
-              <wp:posOffset>3175</wp:posOffset>
+              <wp:posOffset>302895</wp:posOffset>
             </wp:positionV>
             <wp:extent cx="5943600" cy="3784600"/>
             <wp:effectExtent l="0" t="0" r="0" b="6350"/>
             <wp:wrapNone/>
-            <wp:docPr id="993873630" name="Picture 16"/>
+            <wp:docPr id="188950764" name="Picture 14"/>
             <wp:cNvGraphicFramePr>
               <a:graphicFrameLocks xmlns:a="http://schemas.openxmlformats.org/drawingml/2006/main" noChangeAspect="1"/>
             </wp:cNvGraphicFramePr>
@@ -2661,7 +2621,7 @@
               <a:graphicData uri="http://schemas.openxmlformats.org/drawingml/2006/picture">
                 <pic:pic xmlns:pic="http://schemas.openxmlformats.org/drawingml/2006/picture">
                   <pic:nvPicPr>
-                    <pic:cNvPr id="0" name="Picture 16"/>
+                    <pic:cNvPr id="0" name="Picture 14"/>
                     <pic:cNvPicPr>
                       <a:picLocks noChangeAspect="1" noChangeArrowheads="1"/>
                     </pic:cNvPicPr>
@@ -2698,146 +2658,166 @@
           </wp:anchor>
         </w:drawing>
       </w:r>
-    </w:p>
-    <w:p>
-      <w:pPr>
-        <w:rPr>
-          <w:rFonts w:ascii="Times New Roman" w:hAnsi="Times New Roman" w:cs="Times New Roman"/>
-        </w:rPr>
-      </w:pPr>
-    </w:p>
-    <w:p>
-      <w:pPr>
-        <w:rPr>
-          <w:rFonts w:ascii="Times New Roman" w:hAnsi="Times New Roman" w:cs="Times New Roman"/>
-        </w:rPr>
-      </w:pPr>
-    </w:p>
-    <w:p>
-      <w:pPr>
-        <w:rPr>
-          <w:rFonts w:ascii="Times New Roman" w:hAnsi="Times New Roman" w:cs="Times New Roman"/>
-        </w:rPr>
-      </w:pPr>
-    </w:p>
-    <w:p>
-      <w:pPr>
-        <w:rPr>
-          <w:rFonts w:ascii="Times New Roman" w:hAnsi="Times New Roman" w:cs="Times New Roman"/>
-        </w:rPr>
-      </w:pPr>
-    </w:p>
-    <w:p>
-      <w:pPr>
-        <w:rPr>
-          <w:rFonts w:ascii="Times New Roman" w:hAnsi="Times New Roman" w:cs="Times New Roman"/>
-        </w:rPr>
-      </w:pPr>
-    </w:p>
-    <w:p>
-      <w:pPr>
-        <w:rPr>
-          <w:rFonts w:ascii="Times New Roman" w:hAnsi="Times New Roman" w:cs="Times New Roman"/>
-        </w:rPr>
-      </w:pPr>
-    </w:p>
-    <w:p>
-      <w:pPr>
-        <w:rPr>
-          <w:rFonts w:ascii="Times New Roman" w:hAnsi="Times New Roman" w:cs="Times New Roman"/>
-        </w:rPr>
-      </w:pPr>
-    </w:p>
-    <w:p>
-      <w:pPr>
-        <w:rPr>
-          <w:rFonts w:ascii="Times New Roman" w:hAnsi="Times New Roman" w:cs="Times New Roman"/>
-        </w:rPr>
-      </w:pPr>
-    </w:p>
-    <w:p>
-      <w:pPr>
-        <w:rPr>
-          <w:rFonts w:ascii="Times New Roman" w:hAnsi="Times New Roman" w:cs="Times New Roman"/>
-        </w:rPr>
-      </w:pPr>
-    </w:p>
-    <w:p>
-      <w:pPr>
-        <w:rPr>
-          <w:rFonts w:ascii="Times New Roman" w:hAnsi="Times New Roman" w:cs="Times New Roman"/>
-        </w:rPr>
-      </w:pPr>
-    </w:p>
-    <w:p>
-      <w:pPr>
-        <w:rPr>
-          <w:rFonts w:ascii="Times New Roman" w:hAnsi="Times New Roman" w:cs="Times New Roman"/>
-        </w:rPr>
-      </w:pPr>
-    </w:p>
-    <w:p>
-      <w:pPr>
-        <w:rPr>
-          <w:rFonts w:ascii="Times New Roman" w:hAnsi="Times New Roman" w:cs="Times New Roman"/>
-        </w:rPr>
-      </w:pPr>
-    </w:p>
-    <w:p>
-      <w:pPr>
-        <w:rPr>
-          <w:rFonts w:ascii="Times New Roman" w:hAnsi="Times New Roman" w:cs="Times New Roman"/>
-        </w:rPr>
-      </w:pPr>
-    </w:p>
-    <w:p>
-      <w:pPr>
-        <w:rPr>
-          <w:rFonts w:ascii="Times New Roman" w:hAnsi="Times New Roman" w:cs="Times New Roman"/>
-        </w:rPr>
-      </w:pPr>
-    </w:p>
-    <w:p>
-      <w:pPr>
-        <w:rPr>
-          <w:rFonts w:ascii="Times New Roman" w:hAnsi="Times New Roman" w:cs="Times New Roman"/>
-        </w:rPr>
-      </w:pPr>
-    </w:p>
-    <w:p>
-      <w:pPr>
-        <w:rPr>
-          <w:rFonts w:ascii="Times New Roman" w:hAnsi="Times New Roman" w:cs="Times New Roman"/>
-        </w:rPr>
-      </w:pPr>
-    </w:p>
-    <w:p>
-      <w:pPr>
-        <w:rPr>
-          <w:rFonts w:ascii="Times New Roman" w:hAnsi="Times New Roman" w:cs="Times New Roman"/>
-        </w:rPr>
-      </w:pPr>
-    </w:p>
-    <w:p>
-      <w:pPr>
-        <w:rPr>
-          <w:rFonts w:ascii="Times New Roman" w:hAnsi="Times New Roman" w:cs="Times New Roman"/>
-        </w:rPr>
-      </w:pPr>
-    </w:p>
-    <w:p>
-      <w:pPr>
-        <w:rPr>
-          <w:rFonts w:ascii="Times New Roman" w:hAnsi="Times New Roman" w:cs="Times New Roman"/>
-        </w:rPr>
-      </w:pPr>
-    </w:p>
-    <w:p>
-      <w:pPr>
-        <w:rPr>
-          <w:rFonts w:ascii="Times New Roman" w:hAnsi="Times New Roman" w:cs="Times New Roman"/>
-        </w:rPr>
-      </w:pPr>
+      <w:r>
+        <w:rPr>
+          <w:rFonts w:ascii="Times New Roman" w:hAnsi="Times New Roman" w:cs="Times New Roman"/>
+        </w:rPr>
+        <w:t>SOLUTION ACCEPTED (STAFF):</w:t>
+      </w:r>
+    </w:p>
+    <w:p>
+      <w:pPr>
+        <w:rPr>
+          <w:rFonts w:ascii="Times New Roman" w:hAnsi="Times New Roman" w:cs="Times New Roman"/>
+        </w:rPr>
+      </w:pPr>
+    </w:p>
+    <w:p>
+      <w:pPr>
+        <w:rPr>
+          <w:rFonts w:ascii="Times New Roman" w:hAnsi="Times New Roman" w:cs="Times New Roman"/>
+        </w:rPr>
+      </w:pPr>
+    </w:p>
+    <w:p>
+      <w:pPr>
+        <w:rPr>
+          <w:rFonts w:ascii="Times New Roman" w:hAnsi="Times New Roman" w:cs="Times New Roman"/>
+        </w:rPr>
+      </w:pPr>
+    </w:p>
+    <w:p>
+      <w:pPr>
+        <w:rPr>
+          <w:rFonts w:ascii="Times New Roman" w:hAnsi="Times New Roman" w:cs="Times New Roman"/>
+        </w:rPr>
+      </w:pPr>
+    </w:p>
+    <w:p>
+      <w:pPr>
+        <w:rPr>
+          <w:rFonts w:ascii="Times New Roman" w:hAnsi="Times New Roman" w:cs="Times New Roman"/>
+        </w:rPr>
+      </w:pPr>
+    </w:p>
+    <w:p>
+      <w:pPr>
+        <w:rPr>
+          <w:rFonts w:ascii="Times New Roman" w:hAnsi="Times New Roman" w:cs="Times New Roman"/>
+        </w:rPr>
+      </w:pPr>
+    </w:p>
+    <w:p>
+      <w:pPr>
+        <w:rPr>
+          <w:rFonts w:ascii="Times New Roman" w:hAnsi="Times New Roman" w:cs="Times New Roman"/>
+        </w:rPr>
+      </w:pPr>
+    </w:p>
+    <w:p>
+      <w:pPr>
+        <w:rPr>
+          <w:rFonts w:ascii="Times New Roman" w:hAnsi="Times New Roman" w:cs="Times New Roman"/>
+        </w:rPr>
+      </w:pPr>
+    </w:p>
+    <w:p>
+      <w:pPr>
+        <w:rPr>
+          <w:rFonts w:ascii="Times New Roman" w:hAnsi="Times New Roman" w:cs="Times New Roman"/>
+        </w:rPr>
+      </w:pPr>
+    </w:p>
+    <w:p>
+      <w:pPr>
+        <w:rPr>
+          <w:rFonts w:ascii="Times New Roman" w:hAnsi="Times New Roman" w:cs="Times New Roman"/>
+        </w:rPr>
+      </w:pPr>
+    </w:p>
+    <w:p>
+      <w:pPr>
+        <w:rPr>
+          <w:rFonts w:ascii="Times New Roman" w:hAnsi="Times New Roman" w:cs="Times New Roman"/>
+        </w:rPr>
+      </w:pPr>
+    </w:p>
+    <w:p>
+      <w:pPr>
+        <w:rPr>
+          <w:rFonts w:ascii="Times New Roman" w:hAnsi="Times New Roman" w:cs="Times New Roman"/>
+        </w:rPr>
+      </w:pPr>
+    </w:p>
+    <w:p>
+      <w:pPr>
+        <w:rPr>
+          <w:rFonts w:ascii="Times New Roman" w:hAnsi="Times New Roman" w:cs="Times New Roman"/>
+        </w:rPr>
+      </w:pPr>
+    </w:p>
+    <w:p>
+      <w:pPr>
+        <w:rPr>
+          <w:rFonts w:ascii="Times New Roman" w:hAnsi="Times New Roman" w:cs="Times New Roman"/>
+        </w:rPr>
+      </w:pPr>
+    </w:p>
+    <w:p>
+      <w:pPr>
+        <w:rPr>
+          <w:rFonts w:ascii="Times New Roman" w:hAnsi="Times New Roman" w:cs="Times New Roman"/>
+        </w:rPr>
+      </w:pPr>
+    </w:p>
+    <w:p>
+      <w:pPr>
+        <w:rPr>
+          <w:rFonts w:ascii="Times New Roman" w:hAnsi="Times New Roman" w:cs="Times New Roman"/>
+        </w:rPr>
+      </w:pPr>
+    </w:p>
+    <w:p>
+      <w:pPr>
+        <w:rPr>
+          <w:rFonts w:ascii="Times New Roman" w:hAnsi="Times New Roman" w:cs="Times New Roman"/>
+        </w:rPr>
+      </w:pPr>
+    </w:p>
+    <w:p>
+      <w:pPr>
+        <w:rPr>
+          <w:rFonts w:ascii="Times New Roman" w:hAnsi="Times New Roman" w:cs="Times New Roman"/>
+        </w:rPr>
+      </w:pPr>
+    </w:p>
+    <w:p>
+      <w:pPr>
+        <w:rPr>
+          <w:rFonts w:ascii="Times New Roman" w:hAnsi="Times New Roman" w:cs="Times New Roman"/>
+        </w:rPr>
+      </w:pPr>
+    </w:p>
+    <w:p>
+      <w:pPr>
+        <w:rPr>
+          <w:rFonts w:ascii="Times New Roman" w:hAnsi="Times New Roman" w:cs="Times New Roman"/>
+        </w:rPr>
+      </w:pPr>
+    </w:p>
+    <w:p>
+      <w:pPr>
+        <w:rPr>
+          <w:rFonts w:ascii="Times New Roman" w:hAnsi="Times New Roman" w:cs="Times New Roman"/>
+        </w:rPr>
+      </w:pPr>
+      <w:r>
+        <w:rPr>
+          <w:rFonts w:ascii="Times New Roman" w:hAnsi="Times New Roman" w:cs="Times New Roman"/>
+        </w:rPr>
+        <w:lastRenderedPageBreak/>
+        <w:t>MARK AS SOLVED:</w:t>
+      </w:r>
     </w:p>
     <w:p>
       <w:pPr>
@@ -2850,7 +2830,159 @@
           <w:rFonts w:ascii="Times New Roman" w:hAnsi="Times New Roman" w:cs="Times New Roman"/>
           <w:noProof/>
         </w:rPr>
-        <w:lastRenderedPageBreak/>
+        <w:drawing>
+          <wp:anchor distT="0" distB="0" distL="114300" distR="114300" simplePos="0" relativeHeight="251679744" behindDoc="0" locked="0" layoutInCell="1" allowOverlap="1" wp14:anchorId="751B7E99" wp14:editId="7BCB0B95">
+            <wp:simplePos x="0" y="0"/>
+            <wp:positionH relativeFrom="column">
+              <wp:posOffset>0</wp:posOffset>
+            </wp:positionH>
+            <wp:positionV relativeFrom="paragraph">
+              <wp:posOffset>3175</wp:posOffset>
+            </wp:positionV>
+            <wp:extent cx="5943600" cy="3784600"/>
+            <wp:effectExtent l="0" t="0" r="0" b="6350"/>
+            <wp:wrapNone/>
+            <wp:docPr id="993873630" name="Picture 16"/>
+            <wp:cNvGraphicFramePr>
+              <a:graphicFrameLocks xmlns:a="http://schemas.openxmlformats.org/drawingml/2006/main" noChangeAspect="1"/>
+            </wp:cNvGraphicFramePr>
+            <a:graphic xmlns:a="http://schemas.openxmlformats.org/drawingml/2006/main">
+              <a:graphicData uri="http://schemas.openxmlformats.org/drawingml/2006/picture">
+                <pic:pic xmlns:pic="http://schemas.openxmlformats.org/drawingml/2006/picture">
+                  <pic:nvPicPr>
+                    <pic:cNvPr id="0" name="Picture 16"/>
+                    <pic:cNvPicPr>
+                      <a:picLocks noChangeAspect="1" noChangeArrowheads="1"/>
+                    </pic:cNvPicPr>
+                  </pic:nvPicPr>
+                  <pic:blipFill>
+                    <a:blip r:embed="rId26" cstate="print">
+                      <a:extLst>
+                        <a:ext uri="{28A0092B-C50C-407E-A947-70E740481C1C}">
+                          <a14:useLocalDpi xmlns:a14="http://schemas.microsoft.com/office/drawing/2010/main" val="0"/>
+                        </a:ext>
+                      </a:extLst>
+                    </a:blip>
+                    <a:srcRect/>
+                    <a:stretch>
+                      <a:fillRect/>
+                    </a:stretch>
+                  </pic:blipFill>
+                  <pic:spPr bwMode="auto">
+                    <a:xfrm>
+                      <a:off x="0" y="0"/>
+                      <a:ext cx="5943600" cy="3784600"/>
+                    </a:xfrm>
+                    <a:prstGeom prst="rect">
+                      <a:avLst/>
+                    </a:prstGeom>
+                    <a:noFill/>
+                    <a:ln>
+                      <a:noFill/>
+                    </a:ln>
+                  </pic:spPr>
+                </pic:pic>
+              </a:graphicData>
+            </a:graphic>
+          </wp:anchor>
+        </w:drawing>
+      </w:r>
+    </w:p>
+    <w:p>
+      <w:pPr>
+        <w:rPr>
+          <w:rFonts w:ascii="Times New Roman" w:hAnsi="Times New Roman" w:cs="Times New Roman"/>
+        </w:rPr>
+      </w:pPr>
+    </w:p>
+    <w:p>
+      <w:pPr>
+        <w:rPr>
+          <w:rFonts w:ascii="Times New Roman" w:hAnsi="Times New Roman" w:cs="Times New Roman"/>
+        </w:rPr>
+      </w:pPr>
+    </w:p>
+    <w:p>
+      <w:pPr>
+        <w:rPr>
+          <w:rFonts w:ascii="Times New Roman" w:hAnsi="Times New Roman" w:cs="Times New Roman"/>
+        </w:rPr>
+      </w:pPr>
+    </w:p>
+    <w:p>
+      <w:pPr>
+        <w:rPr>
+          <w:rFonts w:ascii="Times New Roman" w:hAnsi="Times New Roman" w:cs="Times New Roman"/>
+        </w:rPr>
+      </w:pPr>
+    </w:p>
+    <w:p>
+      <w:pPr>
+        <w:rPr>
+          <w:rFonts w:ascii="Times New Roman" w:hAnsi="Times New Roman" w:cs="Times New Roman"/>
+        </w:rPr>
+      </w:pPr>
+    </w:p>
+    <w:p>
+      <w:pPr>
+        <w:rPr>
+          <w:rFonts w:ascii="Times New Roman" w:hAnsi="Times New Roman" w:cs="Times New Roman"/>
+        </w:rPr>
+      </w:pPr>
+    </w:p>
+    <w:p>
+      <w:pPr>
+        <w:rPr>
+          <w:rFonts w:ascii="Times New Roman" w:hAnsi="Times New Roman" w:cs="Times New Roman"/>
+        </w:rPr>
+      </w:pPr>
+    </w:p>
+    <w:p>
+      <w:pPr>
+        <w:rPr>
+          <w:rFonts w:ascii="Times New Roman" w:hAnsi="Times New Roman" w:cs="Times New Roman"/>
+        </w:rPr>
+      </w:pPr>
+    </w:p>
+    <w:p>
+      <w:pPr>
+        <w:rPr>
+          <w:rFonts w:ascii="Times New Roman" w:hAnsi="Times New Roman" w:cs="Times New Roman"/>
+        </w:rPr>
+      </w:pPr>
+    </w:p>
+    <w:p>
+      <w:pPr>
+        <w:rPr>
+          <w:rFonts w:ascii="Times New Roman" w:hAnsi="Times New Roman" w:cs="Times New Roman"/>
+        </w:rPr>
+      </w:pPr>
+    </w:p>
+    <w:p>
+      <w:pPr>
+        <w:rPr>
+          <w:rFonts w:ascii="Times New Roman" w:hAnsi="Times New Roman" w:cs="Times New Roman"/>
+        </w:rPr>
+      </w:pPr>
+    </w:p>
+    <w:p>
+      <w:pPr>
+        <w:rPr>
+          <w:rFonts w:ascii="Times New Roman" w:hAnsi="Times New Roman" w:cs="Times New Roman"/>
+        </w:rPr>
+      </w:pPr>
+    </w:p>
+    <w:p>
+      <w:pPr>
+        <w:rPr>
+          <w:rFonts w:ascii="Times New Roman" w:hAnsi="Times New Roman" w:cs="Times New Roman"/>
+        </w:rPr>
+      </w:pPr>
+      <w:r>
+        <w:rPr>
+          <w:rFonts w:ascii="Times New Roman" w:hAnsi="Times New Roman" w:cs="Times New Roman"/>
+          <w:noProof/>
+        </w:rPr>
         <w:drawing>
           <wp:anchor distT="0" distB="0" distL="114300" distR="114300" simplePos="0" relativeHeight="251681792" behindDoc="0" locked="0" layoutInCell="1" allowOverlap="1" wp14:anchorId="2D7FEF0A" wp14:editId="4B078D78">
             <wp:simplePos x="0" y="0"/>
@@ -2877,7 +3009,7 @@
                     </pic:cNvPicPr>
                   </pic:nvPicPr>
                   <pic:blipFill>
-                    <a:blip r:embed="rId26" cstate="print">
+                    <a:blip r:embed="rId27" cstate="print">
                       <a:extLst>
                         <a:ext uri="{28A0092B-C50C-407E-A947-70E740481C1C}">
                           <a14:useLocalDpi xmlns:a14="http://schemas.microsoft.com/office/drawing/2010/main" val="0"/>
@@ -3029,7 +3161,7 @@
                     </pic:cNvPicPr>
                   </pic:nvPicPr>
                   <pic:blipFill>
-                    <a:blip r:embed="rId27" cstate="print">
+                    <a:blip r:embed="rId28" cstate="print">
                       <a:extLst>
                         <a:ext uri="{28A0092B-C50C-407E-A947-70E740481C1C}">
                           <a14:useLocalDpi xmlns:a14="http://schemas.microsoft.com/office/drawing/2010/main" val="0"/>
@@ -3130,24 +3262,11 @@
           <w:rFonts w:ascii="Times New Roman" w:hAnsi="Times New Roman" w:cs="Times New Roman"/>
         </w:rPr>
       </w:pPr>
-    </w:p>
-    <w:p>
-      <w:pPr>
-        <w:rPr>
-          <w:rFonts w:ascii="Times New Roman" w:hAnsi="Times New Roman" w:cs="Times New Roman"/>
-        </w:rPr>
-      </w:pPr>
-    </w:p>
-    <w:p>
-      <w:pPr>
-        <w:rPr>
-          <w:rFonts w:ascii="Times New Roman" w:hAnsi="Times New Roman" w:cs="Times New Roman"/>
-        </w:rPr>
-      </w:pPr>
-      <w:r>
-        <w:rPr>
-          <w:rFonts w:ascii="Times New Roman" w:hAnsi="Times New Roman" w:cs="Times New Roman"/>
-        </w:rPr>
+      <w:r>
+        <w:rPr>
+          <w:rFonts w:ascii="Times New Roman" w:hAnsi="Times New Roman" w:cs="Times New Roman"/>
+        </w:rPr>
+        <w:lastRenderedPageBreak/>
         <w:t>STAFF CHAT (END CONVERSTION):</w:t>
       </w:r>
     </w:p>
@@ -3188,7 +3307,7 @@
                     </pic:cNvPicPr>
                   </pic:nvPicPr>
                   <pic:blipFill>
-                    <a:blip r:embed="rId28" cstate="print">
+                    <a:blip r:embed="rId29" cstate="print">
                       <a:extLst>
                         <a:ext uri="{28A0092B-C50C-407E-A947-70E740481C1C}">
                           <a14:useLocalDpi xmlns:a14="http://schemas.microsoft.com/office/drawing/2010/main" val="0"/>
@@ -3301,7 +3420,6 @@
           <w:rFonts w:ascii="Times New Roman" w:hAnsi="Times New Roman" w:cs="Times New Roman"/>
           <w:noProof/>
         </w:rPr>
-        <w:lastRenderedPageBreak/>
         <w:drawing>
           <wp:anchor distT="0" distB="0" distL="114300" distR="114300" simplePos="0" relativeHeight="251673600" behindDoc="0" locked="0" layoutInCell="1" allowOverlap="1" wp14:anchorId="268935F6" wp14:editId="1FF6ED0D">
             <wp:simplePos x="0" y="0"/>
@@ -3328,7 +3446,7 @@
                     </pic:cNvPicPr>
                   </pic:nvPicPr>
                   <pic:blipFill>
-                    <a:blip r:embed="rId29" cstate="print">
+                    <a:blip r:embed="rId30" cstate="print">
                       <a:extLst>
                         <a:ext uri="{28A0092B-C50C-407E-A947-70E740481C1C}">
                           <a14:useLocalDpi xmlns:a14="http://schemas.microsoft.com/office/drawing/2010/main" val="0"/>
@@ -3456,10 +3574,88 @@
           <w:rFonts w:ascii="Times New Roman" w:hAnsi="Times New Roman" w:cs="Times New Roman"/>
         </w:rPr>
       </w:pPr>
-      <w:r>
-        <w:rPr>
-          <w:rFonts w:ascii="Times New Roman" w:hAnsi="Times New Roman" w:cs="Times New Roman"/>
-        </w:rPr>
+    </w:p>
+    <w:p>
+      <w:pPr>
+        <w:rPr>
+          <w:rFonts w:ascii="Times New Roman" w:hAnsi="Times New Roman" w:cs="Times New Roman"/>
+        </w:rPr>
+      </w:pPr>
+    </w:p>
+    <w:p>
+      <w:pPr>
+        <w:rPr>
+          <w:rFonts w:ascii="Times New Roman" w:hAnsi="Times New Roman" w:cs="Times New Roman"/>
+        </w:rPr>
+      </w:pPr>
+    </w:p>
+    <w:p>
+      <w:pPr>
+        <w:rPr>
+          <w:rFonts w:ascii="Times New Roman" w:hAnsi="Times New Roman" w:cs="Times New Roman"/>
+        </w:rPr>
+      </w:pPr>
+    </w:p>
+    <w:p>
+      <w:pPr>
+        <w:rPr>
+          <w:rFonts w:ascii="Times New Roman" w:hAnsi="Times New Roman" w:cs="Times New Roman"/>
+        </w:rPr>
+      </w:pPr>
+    </w:p>
+    <w:p>
+      <w:pPr>
+        <w:rPr>
+          <w:rFonts w:ascii="Times New Roman" w:hAnsi="Times New Roman" w:cs="Times New Roman"/>
+        </w:rPr>
+      </w:pPr>
+    </w:p>
+    <w:p>
+      <w:pPr>
+        <w:rPr>
+          <w:rFonts w:ascii="Times New Roman" w:hAnsi="Times New Roman" w:cs="Times New Roman"/>
+        </w:rPr>
+      </w:pPr>
+    </w:p>
+    <w:p>
+      <w:pPr>
+        <w:rPr>
+          <w:rFonts w:ascii="Times New Roman" w:hAnsi="Times New Roman" w:cs="Times New Roman"/>
+        </w:rPr>
+      </w:pPr>
+    </w:p>
+    <w:p>
+      <w:pPr>
+        <w:rPr>
+          <w:rFonts w:ascii="Times New Roman" w:hAnsi="Times New Roman" w:cs="Times New Roman"/>
+        </w:rPr>
+      </w:pPr>
+    </w:p>
+    <w:p>
+      <w:pPr>
+        <w:rPr>
+          <w:rFonts w:ascii="Times New Roman" w:hAnsi="Times New Roman" w:cs="Times New Roman"/>
+        </w:rPr>
+      </w:pPr>
+    </w:p>
+    <w:p>
+      <w:pPr>
+        <w:rPr>
+          <w:rFonts w:ascii="Times New Roman" w:hAnsi="Times New Roman" w:cs="Times New Roman"/>
+        </w:rPr>
+      </w:pPr>
+    </w:p>
+    <w:p>
+      <w:pPr>
+        <w:rPr>
+          <w:rFonts w:ascii="Times New Roman" w:hAnsi="Times New Roman" w:cs="Times New Roman"/>
+        </w:rPr>
+      </w:pPr>
+      <w:r>
+        <w:rPr>
+          <w:rFonts w:ascii="Times New Roman" w:hAnsi="Times New Roman" w:cs="Times New Roman"/>
+        </w:rPr>
+        <w:lastRenderedPageBreak/>
         <w:t>STAFF DASHBOARD:</w:t>
       </w:r>
     </w:p>
@@ -3492,7 +3688,7 @@
                     </pic:cNvPicPr>
                   </pic:nvPicPr>
                   <pic:blipFill>
-                    <a:blip r:embed="rId30" cstate="print">
+                    <a:blip r:embed="rId31" cstate="print">
                       <a:extLst>
                         <a:ext uri="{28A0092B-C50C-407E-A947-70E740481C1C}">
                           <a14:useLocalDpi xmlns:a14="http://schemas.microsoft.com/office/drawing/2010/main" val="0"/>
@@ -3554,7 +3750,7 @@
                     </pic:cNvPicPr>
                   </pic:nvPicPr>
                   <pic:blipFill>
-                    <a:blip r:embed="rId31" cstate="print">
+                    <a:blip r:embed="rId32" cstate="print">
                       <a:extLst>
                         <a:ext uri="{28A0092B-C50C-407E-A947-70E740481C1C}">
                           <a14:useLocalDpi xmlns:a14="http://schemas.microsoft.com/office/drawing/2010/main" val="0"/>
@@ -3613,7 +3809,6 @@
           <w:rFonts w:ascii="Times New Roman" w:hAnsi="Times New Roman" w:cs="Times New Roman"/>
           <w:noProof/>
         </w:rPr>
-        <w:lastRenderedPageBreak/>
         <w:drawing>
           <wp:anchor distT="0" distB="0" distL="114300" distR="114300" simplePos="0" relativeHeight="251668480" behindDoc="0" locked="0" layoutInCell="1" allowOverlap="1" wp14:anchorId="470CDB5C" wp14:editId="1A270C9A">
             <wp:simplePos x="0" y="0"/>
@@ -3640,7 +3835,7 @@
                     </pic:cNvPicPr>
                   </pic:nvPicPr>
                   <pic:blipFill>
-                    <a:blip r:embed="rId32" cstate="print">
+                    <a:blip r:embed="rId33" cstate="print">
                       <a:extLst>
                         <a:ext uri="{28A0092B-C50C-407E-A947-70E740481C1C}">
                           <a14:useLocalDpi xmlns:a14="http://schemas.microsoft.com/office/drawing/2010/main" val="0"/>
@@ -3768,24 +3963,11 @@
           <w:rFonts w:ascii="Times New Roman" w:hAnsi="Times New Roman" w:cs="Times New Roman"/>
         </w:rPr>
       </w:pPr>
-    </w:p>
-    <w:p>
-      <w:pPr>
-        <w:rPr>
-          <w:rFonts w:ascii="Times New Roman" w:hAnsi="Times New Roman" w:cs="Times New Roman"/>
-        </w:rPr>
-      </w:pPr>
-    </w:p>
-    <w:p>
-      <w:pPr>
-        <w:rPr>
-          <w:rFonts w:ascii="Times New Roman" w:hAnsi="Times New Roman" w:cs="Times New Roman"/>
-        </w:rPr>
-      </w:pPr>
-      <w:r>
-        <w:rPr>
-          <w:rFonts w:ascii="Times New Roman" w:hAnsi="Times New Roman" w:cs="Times New Roman"/>
-        </w:rPr>
+      <w:r>
+        <w:rPr>
+          <w:rFonts w:ascii="Times New Roman" w:hAnsi="Times New Roman" w:cs="Times New Roman"/>
+        </w:rPr>
+        <w:lastRenderedPageBreak/>
         <w:t>ADMIN DASHBOARD (ASSIGNING COMPLAINTS):</w:t>
       </w:r>
     </w:p>
@@ -3826,7 +4008,7 @@
                     </pic:cNvPicPr>
                   </pic:nvPicPr>
                   <pic:blipFill>
-                    <a:blip r:embed="rId33" cstate="print">
+                    <a:blip r:embed="rId34" cstate="print">
                       <a:extLst>
                         <a:ext uri="{28A0092B-C50C-407E-A947-70E740481C1C}">
                           <a14:useLocalDpi xmlns:a14="http://schemas.microsoft.com/office/drawing/2010/main" val="0"/>
@@ -3977,7 +4159,7 @@
                     </pic:cNvPicPr>
                   </pic:nvPicPr>
                   <pic:blipFill>
-                    <a:blip r:embed="rId34" cstate="print">
+                    <a:blip r:embed="rId35" cstate="print">
                       <a:extLst>
                         <a:ext uri="{28A0092B-C50C-407E-A947-70E740481C1C}">
                           <a14:useLocalDpi xmlns:a14="http://schemas.microsoft.com/office/drawing/2010/main" val="0"/>
@@ -4066,8 +4248,8 @@
       </w:pPr>
     </w:p>
     <w:sectPr>
-      <w:headerReference w:type="default" r:id="rId35"/>
-      <w:headerReference w:type="first" r:id="rId36"/>
+      <w:headerReference w:type="default" r:id="rId36"/>
+      <w:headerReference w:type="first" r:id="rId37"/>
       <w:pgSz w:w="12240" w:h="20160" w:code="5"/>
       <w:pgMar w:top="1440" w:right="1440" w:bottom="1440" w:left="1440" w:header="720" w:footer="720" w:gutter="0"/>
       <w:cols w:space="720"/>

</xml_diff>